<commit_message>
feat: implement user onboarding API, document generation script, and experiment frontend interface
</commit_message>
<xml_diff>
--- a/docs/en/3_AI_Model_Documentation.docx
+++ b/docs/en/3_AI_Model_Documentation.docx
@@ -533,10 +533,392 @@
     </w:p>
     <w:p>
       <w:pPr>
+        <w:jc w:val="center"/>
+      </w:pPr>
+      <w:r>
+        <w:rPr>
+          <w:color w:val="B4B4B4"/>
+        </w:rPr>
+        <w:t>__________________________________________________</w:t>
+      </w:r>
+    </w:p>
+    <w:p>
+      <w:pPr>
         <w:pStyle w:val="Heading2"/>
       </w:pPr>
       <w:r>
-        <w:t>4. SHAP (SHapley Additive exPlanations) Attribution</w:t>
+        <w:t>4. Multi-Model Machine Learning Benchmarking &amp; Explainability Trade-Off</w:t>
+      </w:r>
+    </w:p>
+    <w:p>
+      <w:r>
+        <w:t xml:space="preserve">To ensure a robust technical foundation, we trained and benchmarked </w:t>
+      </w:r>
+      <w:r>
+        <w:rPr>
+          <w:b/>
+        </w:rPr>
+        <w:t>4 machine learning classifiers</w:t>
+      </w:r>
+      <w:r>
+        <w:t xml:space="preserve"> on the same dataset:</w:t>
+      </w:r>
+    </w:p>
+    <w:p>
+      <w:pPr>
+        <w:pStyle w:val="ListNumber"/>
+      </w:pPr>
+      <w:r/>
+      <w:r>
+        <w:rPr>
+          <w:b/>
+        </w:rPr>
+        <w:t>Logistic Regression</w:t>
+      </w:r>
+      <w:r>
+        <w:t>: A linear model providing the highest intrinsic explainability, but struggles to capture complex non-linear combinations of risk factors.</w:t>
+      </w:r>
+    </w:p>
+    <w:p>
+      <w:pPr>
+        <w:pStyle w:val="ListNumber"/>
+      </w:pPr>
+      <w:r/>
+      <w:r>
+        <w:rPr>
+          <w:b/>
+        </w:rPr>
+        <w:t>Decision Tree (Single)</w:t>
+      </w:r>
+      <w:r>
+        <w:t>: Provides clear decision rules but is highly prone to overfitting and yields sub-optimal predictive performance.</w:t>
+      </w:r>
+    </w:p>
+    <w:p>
+      <w:pPr>
+        <w:pStyle w:val="ListNumber"/>
+      </w:pPr>
+      <w:r/>
+      <w:r>
+        <w:rPr>
+          <w:b/>
+        </w:rPr>
+        <w:t>Random Forest</w:t>
+      </w:r>
+      <w:r>
+        <w:t>: An ensemble model combining 100 decision trees. It achieves a superior balance of high accuracy and robust explainability.</w:t>
+      </w:r>
+    </w:p>
+    <w:p>
+      <w:pPr>
+        <w:pStyle w:val="ListNumber"/>
+      </w:pPr>
+      <w:r/>
+      <w:r>
+        <w:rPr>
+          <w:b/>
+        </w:rPr>
+        <w:t>XGBoost (Gradient Boosting)</w:t>
+      </w:r>
+      <w:r>
+        <w:t>: A state-of-the-art ensemble method that iteratively optimizes weak learners to achieve maximum predictive performance.</w:t>
+      </w:r>
+    </w:p>
+    <w:p>
+      <w:pPr>
+        <w:pStyle w:val="Heading3"/>
+      </w:pPr>
+      <w:r>
+        <w:t>4.1. Comparative Performance Metrics (Test Set)</w:t>
+      </w:r>
+    </w:p>
+    <w:p>
+      <w:r>
+        <w:t>| Model | Accuracy | Precision | Recall | F1-Score |</w:t>
+      </w:r>
+    </w:p>
+    <w:p>
+      <w:r>
+        <w:t>| :--- | :---: | :---: | :---: | :---: |</w:t>
+      </w:r>
+    </w:p>
+    <w:p>
+      <w:r>
+        <w:t xml:space="preserve">| </w:t>
+      </w:r>
+      <w:r>
+        <w:rPr>
+          <w:b/>
+        </w:rPr>
+        <w:t>Logistic Regression</w:t>
+      </w:r>
+      <w:r>
+        <w:t xml:space="preserve"> | 87.55% | 79.59% | 64.44% | 71.21% |</w:t>
+      </w:r>
+    </w:p>
+    <w:p>
+      <w:r>
+        <w:t xml:space="preserve">| </w:t>
+      </w:r>
+      <w:r>
+        <w:rPr>
+          <w:b/>
+        </w:rPr>
+        <w:t>Decision Tree</w:t>
+      </w:r>
+      <w:r>
+        <w:t xml:space="preserve"> | 86.95% | 74.89% | 68.31% | 71.44% |</w:t>
+      </w:r>
+    </w:p>
+    <w:p>
+      <w:r>
+        <w:t xml:space="preserve">| </w:t>
+      </w:r>
+      <w:r>
+        <w:rPr>
+          <w:b/>
+        </w:rPr>
+        <w:t>Random Forest</w:t>
+      </w:r>
+      <w:r>
+        <w:t xml:space="preserve"> | </w:t>
+      </w:r>
+      <w:r>
+        <w:rPr>
+          <w:b/>
+        </w:rPr>
+        <w:t>88.08%</w:t>
+      </w:r>
+      <w:r>
+        <w:t xml:space="preserve"> | </w:t>
+      </w:r>
+      <w:r>
+        <w:rPr>
+          <w:b/>
+        </w:rPr>
+        <w:t>80.35%</w:t>
+      </w:r>
+      <w:r>
+        <w:t xml:space="preserve"> | 66.32% | </w:t>
+      </w:r>
+      <w:r>
+        <w:rPr>
+          <w:b/>
+        </w:rPr>
+        <w:t>72.66%</w:t>
+      </w:r>
+      <w:r>
+        <w:t xml:space="preserve"> |</w:t>
+      </w:r>
+    </w:p>
+    <w:p>
+      <w:r>
+        <w:t xml:space="preserve">| </w:t>
+      </w:r>
+      <w:r>
+        <w:rPr>
+          <w:b/>
+        </w:rPr>
+        <w:t>XGBoost</w:t>
+      </w:r>
+      <w:r>
+        <w:t xml:space="preserve"> | 87.43% | 76.62% | </w:t>
+      </w:r>
+      <w:r>
+        <w:rPr>
+          <w:b/>
+        </w:rPr>
+        <w:t>68.20%</w:t>
+      </w:r>
+      <w:r>
+        <w:t xml:space="preserve"> | 72.16% |</w:t>
+      </w:r>
+    </w:p>
+    <w:p>
+      <w:r>
+        <w:drawing>
+          <wp:inline xmlns:a="http://schemas.openxmlformats.org/drawingml/2006/main" xmlns:pic="http://schemas.openxmlformats.org/drawingml/2006/picture">
+            <wp:extent cx="5303520" cy="2946400"/>
+            <wp:docPr id="4" name="Picture 4"/>
+            <wp:cNvGraphicFramePr>
+              <a:graphicFrameLocks noChangeAspect="1"/>
+            </wp:cNvGraphicFramePr>
+            <a:graphic>
+              <a:graphicData uri="http://schemas.openxmlformats.org/drawingml/2006/picture">
+                <pic:pic>
+                  <pic:nvPicPr>
+                    <pic:cNvPr id="0" name="model_comparison_en.png"/>
+                    <pic:cNvPicPr/>
+                  </pic:nvPicPr>
+                  <pic:blipFill>
+                    <a:blip r:embed="rId12"/>
+                    <a:stretch>
+                      <a:fillRect/>
+                    </a:stretch>
+                  </pic:blipFill>
+                  <pic:spPr>
+                    <a:xfrm>
+                      <a:off x="0" y="0"/>
+                      <a:ext cx="5303520" cy="2946400"/>
+                    </a:xfrm>
+                    <a:prstGeom prst="rect"/>
+                  </pic:spPr>
+                </pic:pic>
+              </a:graphicData>
+            </a:graphic>
+          </wp:inline>
+        </w:drawing>
+      </w:r>
+    </w:p>
+    <w:p>
+      <w:pPr>
+        <w:jc w:val="center"/>
+      </w:pPr>
+      <w:r>
+        <w:rPr>
+          <w:i/>
+          <w:color w:val="646464"/>
+          <w:sz w:val="19"/>
+        </w:rPr>
+        <w:t>Hình: Model Performance Comparison</w:t>
+      </w:r>
+    </w:p>
+    <w:p>
+      <w:r>
+        <w:t>*Discussion*: Random Forest yields the best overall Accuracy and F1-Score for this credit risk classification task. Logistic Regression offers highly competitive baseline performance (87.55%).</w:t>
+      </w:r>
+    </w:p>
+    <w:p>
+      <w:pPr>
+        <w:pStyle w:val="Heading3"/>
+      </w:pPr>
+      <w:r>
+        <w:t>4.2. SHAP Interpretability: Simple vs. Complex Models</w:t>
+      </w:r>
+    </w:p>
+    <w:p>
+      <w:r>
+        <w:t xml:space="preserve">The trade-off between </w:t>
+      </w:r>
+      <w:r>
+        <w:rPr>
+          <w:b/>
+        </w:rPr>
+        <w:t>Accuracy</w:t>
+      </w:r>
+      <w:r>
+        <w:t xml:space="preserve"> and </w:t>
+      </w:r>
+      <w:r>
+        <w:rPr>
+          <w:b/>
+        </w:rPr>
+        <w:t>Explainability</w:t>
+      </w:r>
+      <w:r>
+        <w:t xml:space="preserve"> is highlighted when comparing their SHAP feature attributions:</w:t>
+      </w:r>
+    </w:p>
+    <w:p>
+      <w:pPr>
+        <w:pStyle w:val="ListBullet"/>
+      </w:pPr>
+      <w:r>
+        <w:t xml:space="preserve">  </w:t>
+      </w:r>
+      <w:r>
+        <w:rPr>
+          <w:b/>
+        </w:rPr>
+        <w:t>Simple Model (Decision Tree)</w:t>
+      </w:r>
+      <w:r>
+        <w:t>: Attributes importances aggressively to a few key node splits (such as Previous Loan Defaults and DTI Ratio), ignoring minor but significant contributing signals.</w:t>
+      </w:r>
+    </w:p>
+    <w:p>
+      <w:pPr>
+        <w:pStyle w:val="ListBullet"/>
+      </w:pPr>
+      <w:r>
+        <w:t xml:space="preserve">  </w:t>
+      </w:r>
+      <w:r>
+        <w:rPr>
+          <w:b/>
+        </w:rPr>
+        <w:t>Complex Model (XGBoost / Random Forest)</w:t>
+      </w:r>
+      <w:r>
+        <w:t>: Distributes feature importances smoothly across all 8 features, revealing the complex, multi-dimensional correlations that reflect actual credit default patterns.</w:t>
+      </w:r>
+    </w:p>
+    <w:p>
+      <w:r>
+        <w:drawing>
+          <wp:inline xmlns:a="http://schemas.openxmlformats.org/drawingml/2006/main" xmlns:pic="http://schemas.openxmlformats.org/drawingml/2006/picture">
+            <wp:extent cx="5303520" cy="2692786"/>
+            <wp:docPr id="5" name="Picture 5"/>
+            <wp:cNvGraphicFramePr>
+              <a:graphicFrameLocks noChangeAspect="1"/>
+            </wp:cNvGraphicFramePr>
+            <a:graphic>
+              <a:graphicData uri="http://schemas.openxmlformats.org/drawingml/2006/picture">
+                <pic:pic>
+                  <pic:nvPicPr>
+                    <pic:cNvPr id="0" name="shap_comparison_en.png"/>
+                    <pic:cNvPicPr/>
+                  </pic:nvPicPr>
+                  <pic:blipFill>
+                    <a:blip r:embed="rId13"/>
+                    <a:stretch>
+                      <a:fillRect/>
+                    </a:stretch>
+                  </pic:blipFill>
+                  <pic:spPr>
+                    <a:xfrm>
+                      <a:off x="0" y="0"/>
+                      <a:ext cx="5303520" cy="2692786"/>
+                    </a:xfrm>
+                    <a:prstGeom prst="rect"/>
+                  </pic:spPr>
+                </pic:pic>
+              </a:graphicData>
+            </a:graphic>
+          </wp:inline>
+        </w:drawing>
+      </w:r>
+    </w:p>
+    <w:p>
+      <w:pPr>
+        <w:jc w:val="center"/>
+      </w:pPr>
+      <w:r>
+        <w:rPr>
+          <w:i/>
+          <w:color w:val="646464"/>
+          <w:sz w:val="19"/>
+        </w:rPr>
+        <w:t>Hình: SHAP Importance Comparison</w:t>
+      </w:r>
+    </w:p>
+    <w:p>
+      <w:pPr>
+        <w:jc w:val="center"/>
+      </w:pPr>
+      <w:r>
+        <w:rPr>
+          <w:color w:val="B4B4B4"/>
+        </w:rPr>
+        <w:t>__________________________________________________</w:t>
+      </w:r>
+    </w:p>
+    <w:p>
+      <w:pPr>
+        <w:pStyle w:val="Heading2"/>
+      </w:pPr>
+      <w:r>
+        <w:t>5. SHAP (SHapley Additive exPlanations) Attribution</w:t>
       </w:r>
     </w:p>
     <w:p>

</xml_diff>